<commit_message>
Add lagmapping to examples index
</commit_message>
<xml_diff>
--- a/examples/doc/README.docx
+++ b/examples/doc/README.docx
@@ -2,7 +2,7 @@
 <file path=word/document.xml><?xml version="1.0" encoding="utf-8"?>
 <w:document xmlns:w="http://schemas.openxmlformats.org/wordprocessingml/2006/main" xmlns:m="http://schemas.openxmlformats.org/officeDocument/2006/math" xmlns:r="http://schemas.openxmlformats.org/officeDocument/2006/relationships" xmlns:o="urn:schemas-microsoft-com:office:office" xmlns:v="urn:schemas-microsoft-com:vml" xmlns:w10="urn:schemas-microsoft-com:office:word" xmlns:a="http://schemas.openxmlformats.org/drawingml/2006/main" xmlns:pic="http://schemas.openxmlformats.org/drawingml/2006/picture" xmlns:wp="http://schemas.openxmlformats.org/drawingml/2006/wordprocessingDrawing">
   <w:body>
-    <w:bookmarkStart w:id="21" w:name="tspredit-examples"/>
+    <w:bookmarkStart w:id="22" w:name="tspredit-examples"/>
     <w:p>
       <w:pPr>
         <w:pStyle w:val="Heading1"/>
@@ -95,7 +95,7 @@
       </w:r>
     </w:p>
     <w:bookmarkEnd w:id="10"/>
-    <w:bookmarkStart w:id="19" w:name="thematic-collections"/>
+    <w:bookmarkStart w:id="20" w:name="thematic-collections"/>
     <w:p>
       <w:pPr>
         <w:pStyle w:val="Heading2"/>
@@ -240,14 +240,14 @@
           <w:rPr>
             <w:rStyle w:val="Hyperlink"/>
           </w:rPr>
-          <w:t xml:space="preserve">augment</w:t>
+          <w:t xml:space="preserve">lagmapping</w:t>
         </w:r>
       </w:hyperlink>
       <w:r>
         <w:t xml:space="preserve"> </w:t>
       </w:r>
       <w:r>
-        <w:t xml:space="preserve">- augmentation strategies organized from the no-augmentation baseline to shape perturbations and recency-aware schemes.</w:t>
+        <w:t xml:space="preserve">- lag-selection strategies that decide which past observations are exposed to the predictor, from positional baselines to correlation-driven and supervised mappings.</w:t>
       </w:r>
     </w:p>
     <w:p>
@@ -259,6 +259,29 @@
         </w:numPr>
       </w:pPr>
       <w:hyperlink r:id="rId15">
+        <w:r>
+          <w:rPr>
+            <w:rStyle w:val="Hyperlink"/>
+          </w:rPr>
+          <w:t xml:space="preserve">augment</w:t>
+        </w:r>
+      </w:hyperlink>
+      <w:r>
+        <w:t xml:space="preserve"> </w:t>
+      </w:r>
+      <w:r>
+        <w:t xml:space="preserve">- augmentation strategies organized from the no-augmentation baseline to shape perturbations and recency-aware schemes.</w:t>
+      </w:r>
+    </w:p>
+    <w:p>
+      <w:pPr>
+        <w:pStyle w:val="Compact"/>
+        <w:numPr>
+          <w:ilvl w:val="0"/>
+          <w:numId w:val="1002"/>
+        </w:numPr>
+      </w:pPr>
+      <w:hyperlink r:id="rId16">
         <w:r>
           <w:rPr>
             <w:rStyle w:val="Hyperlink"/>
@@ -281,7 +304,7 @@
           <w:numId w:val="1002"/>
         </w:numPr>
       </w:pPr>
-      <w:hyperlink r:id="rId16">
+      <w:hyperlink r:id="rId17">
         <w:r>
           <w:rPr>
             <w:rStyle w:val="Hyperlink"/>
@@ -304,7 +327,7 @@
           <w:numId w:val="1002"/>
         </w:numPr>
       </w:pPr>
-      <w:hyperlink r:id="rId17">
+      <w:hyperlink r:id="rId18">
         <w:r>
           <w:rPr>
             <w:rStyle w:val="Hyperlink"/>
@@ -342,7 +365,7 @@
           <w:numId w:val="1002"/>
         </w:numPr>
       </w:pPr>
-      <w:hyperlink r:id="rId18">
+      <w:hyperlink r:id="rId19">
         <w:r>
           <w:rPr>
             <w:rStyle w:val="Hyperlink"/>
@@ -372,8 +395,8 @@
         <w:t xml:space="preserve">contract.</w:t>
       </w:r>
     </w:p>
-    <w:bookmarkEnd w:id="19"/>
-    <w:bookmarkStart w:id="20" w:name="suggested-reading-order"/>
+    <w:bookmarkEnd w:id="20"/>
+    <w:bookmarkStart w:id="21" w:name="suggested-reading-order"/>
     <w:p>
       <w:pPr>
         <w:pStyle w:val="Heading2"/>
@@ -472,30 +495,6 @@
         </w:rPr>
         <w:t xml:space="preserve">filter</w:t>
       </w:r>
-      <w:r>
-        <w:t xml:space="preserve">,</w:t>
-      </w:r>
-      <w:r>
-        <w:t xml:space="preserve"> </w:t>
-      </w:r>
-      <w:r>
-        <w:rPr>
-          <w:rStyle w:val="VerbatimChar"/>
-        </w:rPr>
-        <w:t xml:space="preserve">augment</w:t>
-      </w:r>
-      <w:r>
-        <w:t xml:space="preserve">, and</w:t>
-      </w:r>
-      <w:r>
-        <w:t xml:space="preserve"> </w:t>
-      </w:r>
-      <w:r>
-        <w:rPr>
-          <w:rStyle w:val="VerbatimChar"/>
-        </w:rPr>
-        <w:t xml:space="preserve">normalization</w:t>
-      </w:r>
     </w:p>
     <w:p>
       <w:pPr>
@@ -509,7 +508,7 @@
         <w:rPr>
           <w:rStyle w:val="VerbatimChar"/>
         </w:rPr>
-        <w:t xml:space="preserve">prediction</w:t>
+        <w:t xml:space="preserve">lagmapping</w:t>
       </w:r>
     </w:p>
     <w:p>
@@ -524,7 +523,22 @@
         <w:rPr>
           <w:rStyle w:val="VerbatimChar"/>
         </w:rPr>
-        <w:t xml:space="preserve">multivariate</w:t>
+        <w:t xml:space="preserve">augment</w:t>
+      </w:r>
+      <w:r>
+        <w:t xml:space="preserve"> </w:t>
+      </w:r>
+      <w:r>
+        <w:t xml:space="preserve">and</w:t>
+      </w:r>
+      <w:r>
+        <w:t xml:space="preserve"> </w:t>
+      </w:r>
+      <w:r>
+        <w:rPr>
+          <w:rStyle w:val="VerbatimChar"/>
+        </w:rPr>
+        <w:t xml:space="preserve">normalization</w:t>
       </w:r>
     </w:p>
     <w:p>
@@ -539,11 +553,49 @@
         <w:rPr>
           <w:rStyle w:val="VerbatimChar"/>
         </w:rPr>
+        <w:t xml:space="preserve">prediction</w:t>
+      </w:r>
+    </w:p>
+    <w:p>
+      <w:pPr>
+        <w:pStyle w:val="Compact"/>
+        <w:numPr>
+          <w:ilvl w:val="0"/>
+          <w:numId w:val="1003"/>
+        </w:numPr>
+      </w:pPr>
+      <w:r>
+        <w:rPr>
+          <w:rStyle w:val="VerbatimChar"/>
+        </w:rPr>
+        <w:t xml:space="preserve">multivariate</w:t>
+      </w:r>
+    </w:p>
+    <w:p>
+      <w:pPr>
+        <w:pStyle w:val="Compact"/>
+        <w:numPr>
+          <w:ilvl w:val="0"/>
+          <w:numId w:val="1003"/>
+        </w:numPr>
+      </w:pPr>
+      <w:r>
+        <w:rPr>
+          <w:rStyle w:val="VerbatimChar"/>
+        </w:rPr>
         <w:t xml:space="preserve">custom</w:t>
       </w:r>
     </w:p>
-    <w:bookmarkEnd w:id="20"/>
+    <w:p>
+      <w:pPr>
+        <w:pStyle w:val="FirstParagraph"/>
+      </w:pPr>
+      <w:r>
+        <w:t xml:space="preserve">This ordering is didactic because it follows the forecasting pipeline more closely: first understand how the series is represented, then inspect the available data, then decide whether to smooth the signal, then decide which lags should become predictors, then apply data expansion and scaling, and only after that compare forecasting models and more advanced extensions.</w:t>
+      </w:r>
+    </w:p>
     <w:bookmarkEnd w:id="21"/>
+    <w:bookmarkEnd w:id="22"/>
     <w:sectPr>
       <w:footnotePr>
         <w:numRestart w:val="eachSect"/>

</xml_diff>